<commit_message>
Fix missing table borders on Subtotal/Discount/VAT/Grand Total rows
python-docx's table.add_row() creates brand-new cells with no border
formatting at all - the table has no default border style, only explicit
per-cell tcBorders set on the original template rows, so the totals rows
rendered with no visible grid lines while every product row above them had
a full box border. Reported with a screenshot showing the numbers floating
outside any visible cell.

Copy tcBorders (and vertical alignment) from the real product content row
onto each totals row's cells when they're created.

Co-Authored-By: Claude Sonnet 5 <noreply@anthropic.com>
</commit_message>
<xml_diff>
--- a/app/quotation_templates/equipment_proposal_garg_dental.docx
+++ b/app/quotation_templates/equipment_proposal_garg_dental.docx
@@ -3048,12 +3048,26 @@
         <w:tc>
           <w:tcPr>
             <w:tcW w:type="dxa" w:w="808"/>
+            <w:tcBorders>
+              <w:top w:val="single" w:sz="4" w:space="0" w:color="auto"/>
+              <w:left w:val="single" w:sz="4" w:space="0" w:color="auto"/>
+              <w:bottom w:val="single" w:sz="4" w:space="0" w:color="auto"/>
+              <w:right w:val="single" w:sz="4" w:space="0" w:color="auto"/>
+            </w:tcBorders>
+            <w:vAlign w:val="center"/>
           </w:tcPr>
           <w:p/>
         </w:tc>
         <w:tc>
           <w:tcPr>
             <w:tcW w:type="dxa" w:w="7734"/>
+            <w:tcBorders>
+              <w:top w:val="single" w:sz="4" w:space="0" w:color="auto"/>
+              <w:left w:val="nil"/>
+              <w:bottom w:val="single" w:sz="4" w:space="0" w:color="auto"/>
+              <w:right w:val="single" w:sz="4" w:space="0" w:color="auto"/>
+            </w:tcBorders>
+            <w:vAlign w:val="center"/>
           </w:tcPr>
           <w:p>
             <w:r>
@@ -3064,6 +3078,13 @@
         <w:tc>
           <w:tcPr>
             <w:tcW w:type="dxa" w:w="2078"/>
+            <w:tcBorders>
+              <w:top w:val="single" w:sz="4" w:space="0" w:color="auto"/>
+              <w:left w:val="nil"/>
+              <w:bottom w:val="single" w:sz="4" w:space="0" w:color="auto"/>
+              <w:right w:val="single" w:sz="4" w:space="0" w:color="auto"/>
+            </w:tcBorders>
+            <w:vAlign w:val="center"/>
           </w:tcPr>
           <w:p>
             <w:r>
@@ -3076,12 +3097,26 @@
         <w:tc>
           <w:tcPr>
             <w:tcW w:type="dxa" w:w="808"/>
+            <w:tcBorders>
+              <w:top w:val="single" w:sz="4" w:space="0" w:color="auto"/>
+              <w:left w:val="single" w:sz="4" w:space="0" w:color="auto"/>
+              <w:bottom w:val="single" w:sz="4" w:space="0" w:color="auto"/>
+              <w:right w:val="single" w:sz="4" w:space="0" w:color="auto"/>
+            </w:tcBorders>
+            <w:vAlign w:val="center"/>
           </w:tcPr>
           <w:p/>
         </w:tc>
         <w:tc>
           <w:tcPr>
             <w:tcW w:type="dxa" w:w="7734"/>
+            <w:tcBorders>
+              <w:top w:val="single" w:sz="4" w:space="0" w:color="auto"/>
+              <w:left w:val="nil"/>
+              <w:bottom w:val="single" w:sz="4" w:space="0" w:color="auto"/>
+              <w:right w:val="single" w:sz="4" w:space="0" w:color="auto"/>
+            </w:tcBorders>
+            <w:vAlign w:val="center"/>
           </w:tcPr>
           <w:p>
             <w:r>
@@ -3092,6 +3127,13 @@
         <w:tc>
           <w:tcPr>
             <w:tcW w:type="dxa" w:w="2078"/>
+            <w:tcBorders>
+              <w:top w:val="single" w:sz="4" w:space="0" w:color="auto"/>
+              <w:left w:val="nil"/>
+              <w:bottom w:val="single" w:sz="4" w:space="0" w:color="auto"/>
+              <w:right w:val="single" w:sz="4" w:space="0" w:color="auto"/>
+            </w:tcBorders>
+            <w:vAlign w:val="center"/>
           </w:tcPr>
           <w:p>
             <w:r>
@@ -3104,12 +3146,26 @@
         <w:tc>
           <w:tcPr>
             <w:tcW w:type="dxa" w:w="808"/>
+            <w:tcBorders>
+              <w:top w:val="single" w:sz="4" w:space="0" w:color="auto"/>
+              <w:left w:val="single" w:sz="4" w:space="0" w:color="auto"/>
+              <w:bottom w:val="single" w:sz="4" w:space="0" w:color="auto"/>
+              <w:right w:val="single" w:sz="4" w:space="0" w:color="auto"/>
+            </w:tcBorders>
+            <w:vAlign w:val="center"/>
           </w:tcPr>
           <w:p/>
         </w:tc>
         <w:tc>
           <w:tcPr>
             <w:tcW w:type="dxa" w:w="7734"/>
+            <w:tcBorders>
+              <w:top w:val="single" w:sz="4" w:space="0" w:color="auto"/>
+              <w:left w:val="nil"/>
+              <w:bottom w:val="single" w:sz="4" w:space="0" w:color="auto"/>
+              <w:right w:val="single" w:sz="4" w:space="0" w:color="auto"/>
+            </w:tcBorders>
+            <w:vAlign w:val="center"/>
           </w:tcPr>
           <w:p>
             <w:r>
@@ -3120,6 +3176,13 @@
         <w:tc>
           <w:tcPr>
             <w:tcW w:type="dxa" w:w="2078"/>
+            <w:tcBorders>
+              <w:top w:val="single" w:sz="4" w:space="0" w:color="auto"/>
+              <w:left w:val="nil"/>
+              <w:bottom w:val="single" w:sz="4" w:space="0" w:color="auto"/>
+              <w:right w:val="single" w:sz="4" w:space="0" w:color="auto"/>
+            </w:tcBorders>
+            <w:vAlign w:val="center"/>
           </w:tcPr>
           <w:p>
             <w:r>
@@ -3132,12 +3195,26 @@
         <w:tc>
           <w:tcPr>
             <w:tcW w:type="dxa" w:w="808"/>
+            <w:tcBorders>
+              <w:top w:val="single" w:sz="4" w:space="0" w:color="auto"/>
+              <w:left w:val="single" w:sz="4" w:space="0" w:color="auto"/>
+              <w:bottom w:val="single" w:sz="4" w:space="0" w:color="auto"/>
+              <w:right w:val="single" w:sz="4" w:space="0" w:color="auto"/>
+            </w:tcBorders>
+            <w:vAlign w:val="center"/>
           </w:tcPr>
           <w:p/>
         </w:tc>
         <w:tc>
           <w:tcPr>
             <w:tcW w:type="dxa" w:w="7734"/>
+            <w:tcBorders>
+              <w:top w:val="single" w:sz="4" w:space="0" w:color="auto"/>
+              <w:left w:val="nil"/>
+              <w:bottom w:val="single" w:sz="4" w:space="0" w:color="auto"/>
+              <w:right w:val="single" w:sz="4" w:space="0" w:color="auto"/>
+            </w:tcBorders>
+            <w:vAlign w:val="center"/>
           </w:tcPr>
           <w:p>
             <w:r>
@@ -3151,6 +3228,13 @@
         <w:tc>
           <w:tcPr>
             <w:tcW w:type="dxa" w:w="2078"/>
+            <w:tcBorders>
+              <w:top w:val="single" w:sz="4" w:space="0" w:color="auto"/>
+              <w:left w:val="nil"/>
+              <w:bottom w:val="single" w:sz="4" w:space="0" w:color="auto"/>
+              <w:right w:val="single" w:sz="4" w:space="0" w:color="auto"/>
+            </w:tcBorders>
+            <w:vAlign w:val="center"/>
           </w:tcPr>
           <w:p>
             <w:r>

</xml_diff>